<commit_message>
docx flavour: pronounced question titles and short/detail answer split
Co-Authored-By: Claude Fable 5 <noreply@anthropic.com>
Claude-Session: https://claude.ai/code/session_01CV4WDCJQ4jwDMMvTM26sTU
</commit_message>
<xml_diff>
--- a/flavours/docx/BSV_Blockchain_FAQ.docx
+++ b/flavours/docx/BSV_Blockchain_FAQ.docx
@@ -70,8 +70,13 @@
     <w:p>
       <w:pPr>
         <w:pStyle w:val="Heading1"/>
-      </w:pPr>
-      <w:r>
+        <w:pageBreakBefore/>
+      </w:pPr>
+      <w:r>
+        <w:rPr>
+          <w:sz w:val="44"/>
+          <w:szCs w:val="44"/>
+        </w:rPr>
         <w:t>The basics</w:t>
       </w:r>
     </w:p>
@@ -80,21 +85,35 @@
         <w:pStyle w:val="Heading2"/>
       </w:pPr>
       <w:r>
+        <w:rPr>
+          <w:color w:val="1B1EA9"/>
+          <w:sz w:val="34"/>
+          <w:szCs w:val="34"/>
+        </w:rPr>
         <w:t>What is BSV?</w:t>
       </w:r>
     </w:p>
     <w:p>
       <w:pPr>
-        <w:pStyle w:val="Normal"/>
+        <w:pStyle w:val="BSVAIntroduction"/>
       </w:pPr>
       <w:r>
         <w:rPr>
           <w:b/>
+          <w:color w:val="1B1EA9"/>
         </w:rPr>
-        <w:t>Short answer.</w:t>
-      </w:r>
-      <w:r>
-        <w:t xml:space="preserve"> BSV is digital money that works over the internet. You can use it to pay someone directly — like handing over cash, but online — and each payment costs less than a cent. It runs on a shared public record that no single company owns or controls.</w:t>
+        <w:t xml:space="preserve">Short answer — </w:t>
+      </w:r>
+      <w:r>
+        <w:t>BSV is digital money that works over the internet. You can use it to pay someone directly — like handing over cash, but online — and each payment costs less than a cent. It runs on a shared public record that no single company owns or controls.</w:t>
+      </w:r>
+    </w:p>
+    <w:p>
+      <w:pPr>
+        <w:pStyle w:val="Heading4"/>
+      </w:pPr>
+      <w:r>
+        <w:t>In more detail</w:t>
       </w:r>
     </w:p>
     <w:p>
@@ -142,21 +161,35 @@
         <w:pStyle w:val="Heading2"/>
       </w:pPr>
       <w:r>
+        <w:rPr>
+          <w:color w:val="1B1EA9"/>
+          <w:sz w:val="34"/>
+          <w:szCs w:val="34"/>
+        </w:rPr>
         <w:t>How is BSV different from Bitcoin (BTC)?</w:t>
       </w:r>
     </w:p>
     <w:p>
       <w:pPr>
-        <w:pStyle w:val="Normal"/>
+        <w:pStyle w:val="BSVAIntroduction"/>
       </w:pPr>
       <w:r>
         <w:rPr>
           <w:b/>
+          <w:color w:val="1B1EA9"/>
         </w:rPr>
-        <w:t>Short answer.</w:t>
-      </w:r>
-      <w:r>
-        <w:t xml:space="preserve"> BTC and BSV started from the same place in 2009 and use similar core technology. Over time, disagreements split the community into separate networks, and the two now aim at different goals. BTC keeps its blocks — the batches payments are recorded in — deliberately small, and presents itself mainly as something to hold and store value in. BSV removes the limit on block size and presents itself as a network for very large numbers of payments and for data. They are different coins on different chains — you cannot send one to the other.</w:t>
+        <w:t xml:space="preserve">Short answer — </w:t>
+      </w:r>
+      <w:r>
+        <w:t>BTC and BSV started from the same place in 2009 and use similar core technology. Over time, disagreements split the community into separate networks, and the two now aim at different goals. BTC keeps its blocks — the batches payments are recorded in — deliberately small, and presents itself mainly as something to hold and store value in. BSV removes the limit on block size and presents itself as a network for very large numbers of payments and for data. They are different coins on different chains — you cannot send one to the other.</w:t>
+      </w:r>
+    </w:p>
+    <w:p>
+      <w:pPr>
+        <w:pStyle w:val="Heading4"/>
+      </w:pPr>
+      <w:r>
+        <w:t>In more detail</w:t>
       </w:r>
     </w:p>
     <w:p>
@@ -443,21 +476,35 @@
         <w:pStyle w:val="Heading2"/>
       </w:pPr>
       <w:r>
+        <w:rPr>
+          <w:color w:val="1B1EA9"/>
+          <w:sz w:val="34"/>
+          <w:szCs w:val="34"/>
+        </w:rPr>
         <w:t>What is a wallet?</w:t>
       </w:r>
     </w:p>
     <w:p>
       <w:pPr>
-        <w:pStyle w:val="Normal"/>
+        <w:pStyle w:val="BSVAIntroduction"/>
       </w:pPr>
       <w:r>
         <w:rPr>
           <w:b/>
+          <w:color w:val="1B1EA9"/>
         </w:rPr>
-        <w:t>Short answer.</w:t>
-      </w:r>
-      <w:r>
-        <w:t xml:space="preserve"> A wallet is an app that holds the keys to your coins and lets you send and receive them. The coins themselves live on the blockchain — the shared public record. The wallet holds your private keys: the secret codes that prove the coins are yours and let you spend them.</w:t>
+        <w:t xml:space="preserve">Short answer — </w:t>
+      </w:r>
+      <w:r>
+        <w:t>A wallet is an app that holds the keys to your coins and lets you send and receive them. The coins themselves live on the blockchain — the shared public record. The wallet holds your private keys: the secret codes that prove the coins are yours and let you spend them.</w:t>
+      </w:r>
+    </w:p>
+    <w:p>
+      <w:pPr>
+        <w:pStyle w:val="Heading4"/>
+      </w:pPr>
+      <w:r>
+        <w:t>In more detail</w:t>
       </w:r>
     </w:p>
     <w:p>
@@ -515,8 +562,13 @@
     <w:p>
       <w:pPr>
         <w:pStyle w:val="Heading1"/>
-      </w:pPr>
-      <w:r>
+        <w:pageBreakBefore/>
+      </w:pPr>
+      <w:r>
+        <w:rPr>
+          <w:sz w:val="44"/>
+          <w:szCs w:val="44"/>
+        </w:rPr>
         <w:t>Using BSV</w:t>
       </w:r>
     </w:p>
@@ -525,21 +577,35 @@
         <w:pStyle w:val="Heading2"/>
       </w:pPr>
       <w:r>
+        <w:rPr>
+          <w:color w:val="1B1EA9"/>
+          <w:sz w:val="34"/>
+          <w:szCs w:val="34"/>
+        </w:rPr>
         <w:t>Where can I get BSV?</w:t>
       </w:r>
     </w:p>
     <w:p>
       <w:pPr>
-        <w:pStyle w:val="Normal"/>
+        <w:pStyle w:val="BSVAIntroduction"/>
       </w:pPr>
       <w:r>
         <w:rPr>
           <w:b/>
+          <w:color w:val="1B1EA9"/>
         </w:rPr>
-        <w:t>Short answer.</w:t>
-      </w:r>
-      <w:r>
-        <w:t xml:space="preserve"> There are three common ways. You can buy BSV on a digital-asset exchange that lists it. You can receive it directly from another person or business — BSV is a payment network, so anyone can send it to your wallet. Or you can earn it by selling goods, services, or data in apps that accept BSV. Which exchanges you can use depends on your country and its rules.</w:t>
+        <w:t xml:space="preserve">Short answer — </w:t>
+      </w:r>
+      <w:r>
+        <w:t>There are three common ways. You can buy BSV on a digital-asset exchange that lists it. You can receive it directly from another person or business — BSV is a payment network, so anyone can send it to your wallet. Or you can earn it by selling goods, services, or data in apps that accept BSV. Which exchanges you can use depends on your country and its rules.</w:t>
+      </w:r>
+    </w:p>
+    <w:p>
+      <w:pPr>
+        <w:pStyle w:val="Heading4"/>
+      </w:pPr>
+      <w:r>
+        <w:t>In more detail</w:t>
       </w:r>
     </w:p>
     <w:p>
@@ -624,21 +690,35 @@
         <w:pStyle w:val="Heading2"/>
       </w:pPr>
       <w:r>
+        <w:rPr>
+          <w:color w:val="1B1EA9"/>
+          <w:sz w:val="34"/>
+          <w:szCs w:val="34"/>
+        </w:rPr>
         <w:t>How do I send and receive BSV?</w:t>
       </w:r>
     </w:p>
     <w:p>
       <w:pPr>
-        <w:pStyle w:val="Normal"/>
+        <w:pStyle w:val="BSVAIntroduction"/>
       </w:pPr>
       <w:r>
         <w:rPr>
           <w:b/>
+          <w:color w:val="1B1EA9"/>
         </w:rPr>
-        <w:t>Short answer.</w:t>
-      </w:r>
-      <w:r>
-        <w:t xml:space="preserve"> To receive: open your wallet and share the address or QR code it shows you. To send: paste or scan the other person's address, enter the amount, and confirm. The payment reaches them in seconds and costs a fraction of a cent. One rule matters most: check the address and the network before you confirm, because blockchain payments cannot be undone.</w:t>
+        <w:t xml:space="preserve">Short answer — </w:t>
+      </w:r>
+      <w:r>
+        <w:t>To receive: open your wallet and share the address or QR code it shows you. To send: paste or scan the other person's address, enter the amount, and confirm. The payment reaches them in seconds and costs a fraction of a cent. One rule matters most: check the address and the network before you confirm, because blockchain payments cannot be undone.</w:t>
+      </w:r>
+    </w:p>
+    <w:p>
+      <w:pPr>
+        <w:pStyle w:val="Heading4"/>
+      </w:pPr>
+      <w:r>
+        <w:t>In more detail</w:t>
       </w:r>
     </w:p>
     <w:p>
@@ -690,21 +770,35 @@
         <w:pStyle w:val="Heading2"/>
       </w:pPr>
       <w:r>
+        <w:rPr>
+          <w:color w:val="1B1EA9"/>
+          <w:sz w:val="34"/>
+          <w:szCs w:val="34"/>
+        </w:rPr>
         <w:t>What are transaction fees, and what do they cost on BSV?</w:t>
       </w:r>
     </w:p>
     <w:p>
       <w:pPr>
-        <w:pStyle w:val="Normal"/>
+        <w:pStyle w:val="BSVAIntroduction"/>
       </w:pPr>
       <w:r>
         <w:rPr>
           <w:b/>
+          <w:color w:val="1B1EA9"/>
         </w:rPr>
-        <w:t>Short answer.</w:t>
-      </w:r>
-      <w:r>
-        <w:t xml:space="preserve"> A fee is a small amount you pay to the companies that process payments, so your payment gets written into the blockchain — a bit like postage on a letter. On BSV, a fee is typically a few satoshis — the smallest unit of the coin, like cents to a dollar — and always well under a cent. Fees stay low because the network's capacity grows with demand, instead of rationing limited space.</w:t>
+        <w:t xml:space="preserve">Short answer — </w:t>
+      </w:r>
+      <w:r>
+        <w:t>A fee is a small amount you pay to the companies that process payments, so your payment gets written into the blockchain — a bit like postage on a letter. On BSV, a fee is typically a few satoshis — the smallest unit of the coin, like cents to a dollar — and always well under a cent. Fees stay low because the network's capacity grows with demand, instead of rationing limited space.</w:t>
+      </w:r>
+    </w:p>
+    <w:p>
+      <w:pPr>
+        <w:pStyle w:val="Heading4"/>
+      </w:pPr>
+      <w:r>
+        <w:t>In more detail</w:t>
       </w:r>
     </w:p>
     <w:p>
@@ -744,21 +838,35 @@
         <w:pStyle w:val="Heading2"/>
       </w:pPr>
       <w:r>
+        <w:rPr>
+          <w:color w:val="1B1EA9"/>
+          <w:sz w:val="34"/>
+          <w:szCs w:val="34"/>
+        </w:rPr>
         <w:t>How do I keep my BSV safe?</w:t>
       </w:r>
     </w:p>
     <w:p>
       <w:pPr>
-        <w:pStyle w:val="Normal"/>
+        <w:pStyle w:val="BSVAIntroduction"/>
       </w:pPr>
       <w:r>
         <w:rPr>
           <w:b/>
+          <w:color w:val="1B1EA9"/>
         </w:rPr>
-        <w:t>Short answer.</w:t>
-      </w:r>
-      <w:r>
-        <w:t xml:space="preserve"> Three habits cover most of the risk. First, guard your recovery phrase offline — never type it into websites, apps, or "support" chats. That request is always a scam. Second, check the address and the network before you send, because payments cannot be undone. Third, treat any investment offer or "recovery" offer you did not ask for as a scam until proven otherwise.</w:t>
+        <w:t xml:space="preserve">Short answer — </w:t>
+      </w:r>
+      <w:r>
+        <w:t>Three habits cover most of the risk. First, guard your recovery phrase offline — never type it into websites, apps, or "support" chats. That request is always a scam. Second, check the address and the network before you send, because payments cannot be undone. Third, treat any investment offer or "recovery" offer you did not ask for as a scam until proven otherwise.</w:t>
+      </w:r>
+    </w:p>
+    <w:p>
+      <w:pPr>
+        <w:pStyle w:val="Heading4"/>
+      </w:pPr>
+      <w:r>
+        <w:t>In more detail</w:t>
       </w:r>
     </w:p>
     <w:p>
@@ -846,21 +954,27 @@
         <w:pStyle w:val="Heading2"/>
       </w:pPr>
       <w:r>
+        <w:rPr>
+          <w:color w:val="1B1EA9"/>
+          <w:sz w:val="34"/>
+          <w:szCs w:val="34"/>
+        </w:rPr>
         <w:t>I lost access to my wallet. Can my coins be recovered?</w:t>
       </w:r>
     </w:p>
     <w:p>
       <w:pPr>
-        <w:pStyle w:val="Normal"/>
+        <w:pStyle w:val="BSVAIntroduction"/>
       </w:pPr>
       <w:r>
         <w:rPr>
           <w:b/>
+          <w:color w:val="1B1EA9"/>
         </w:rPr>
-        <w:t>Short answer.</w:t>
-      </w:r>
-      <w:r>
-        <w:t xml:space="preserve"> It depends on what you lost. Lost the </w:t>
+        <w:t xml:space="preserve">Short answer — </w:t>
+      </w:r>
+      <w:r>
+        <w:t xml:space="preserve">It depends on what you lost. Lost the </w:t>
       </w:r>
       <w:r>
         <w:rPr>
@@ -892,6 +1006,14 @@
     </w:p>
     <w:p>
       <w:pPr>
+        <w:pStyle w:val="Heading4"/>
+      </w:pPr>
+      <w:r>
+        <w:t>In more detail</w:t>
+      </w:r>
+    </w:p>
+    <w:p>
+      <w:pPr>
         <w:pStyle w:val="Normal"/>
       </w:pPr>
       <w:r>
@@ -971,21 +1093,35 @@
         <w:pStyle w:val="Heading2"/>
       </w:pPr>
       <w:r>
+        <w:rPr>
+          <w:color w:val="1B1EA9"/>
+          <w:sz w:val="34"/>
+          <w:szCs w:val="34"/>
+        </w:rPr>
         <w:t>Keeping coins on an exchange vs. in my own wallet — what's the difference?</w:t>
       </w:r>
     </w:p>
     <w:p>
       <w:pPr>
-        <w:pStyle w:val="Normal"/>
+        <w:pStyle w:val="BSVAIntroduction"/>
       </w:pPr>
       <w:r>
         <w:rPr>
           <w:b/>
+          <w:color w:val="1B1EA9"/>
         </w:rPr>
-        <w:t>Short answer.</w:t>
-      </w:r>
-      <w:r>
-        <w:t xml:space="preserve"> On an exchange, the company keeps the keys and owes you your balance — much like a bank account. In your own wallet, you keep the keys. Nobody can freeze, lose, or block your coins — and nobody can help you if you lose the keys. You are trading convenience against self-reliance. It is the single most important choice a holder makes.</w:t>
+        <w:t xml:space="preserve">Short answer — </w:t>
+      </w:r>
+      <w:r>
+        <w:t>On an exchange, the company keeps the keys and owes you your balance — much like a bank account. In your own wallet, you keep the keys. Nobody can freeze, lose, or block your coins — and nobody can help you if you lose the keys. You are trading convenience against self-reliance. It is the single most important choice a holder makes.</w:t>
+      </w:r>
+    </w:p>
+    <w:p>
+      <w:pPr>
+        <w:pStyle w:val="Heading4"/>
+      </w:pPr>
+      <w:r>
+        <w:t>In more detail</w:t>
       </w:r>
     </w:p>
     <w:p>
@@ -1027,8 +1163,13 @@
     <w:p>
       <w:pPr>
         <w:pStyle w:val="Heading1"/>
-      </w:pPr>
-      <w:r>
+        <w:pageBreakBefore/>
+      </w:pPr>
+      <w:r>
+        <w:rPr>
+          <w:sz w:val="44"/>
+          <w:szCs w:val="44"/>
+        </w:rPr>
         <w:t>Exchanges and access</w:t>
       </w:r>
     </w:p>
@@ -1037,21 +1178,27 @@
         <w:pStyle w:val="Heading2"/>
       </w:pPr>
       <w:r>
+        <w:rPr>
+          <w:color w:val="1B1EA9"/>
+          <w:sz w:val="34"/>
+          <w:szCs w:val="34"/>
+        </w:rPr>
         <w:t>An exchange holding my coins is closing. What should I do?</w:t>
       </w:r>
     </w:p>
     <w:p>
       <w:pPr>
-        <w:pStyle w:val="Normal"/>
+        <w:pStyle w:val="BSVAIntroduction"/>
       </w:pPr>
       <w:r>
         <w:rPr>
           <w:b/>
+          <w:color w:val="1B1EA9"/>
         </w:rPr>
-        <w:t>Short answer.</w:t>
-      </w:r>
-      <w:r>
-        <w:t xml:space="preserve"> Follow the exchange's official instructions, and act promptly. Closures normally come with a set period for taking your coins out — often measured in weeks or a couple of months. Move your coins to a wallet that only you control — like taking your money out of a locker and into your own pocket. Check the address and the network carefully before you send. And be very suspicious of anyone who contacts </w:t>
+        <w:t xml:space="preserve">Short answer — </w:t>
+      </w:r>
+      <w:r>
+        <w:t xml:space="preserve">Follow the exchange's official instructions, and act promptly. Closures normally come with a set period for taking your coins out — often measured in weeks or a couple of months. Move your coins to a wallet that only you control — like taking your money out of a locker and into your own pocket. Check the address and the network carefully before you send. And be very suspicious of anyone who contacts </w:t>
       </w:r>
       <w:r>
         <w:rPr>
@@ -1065,6 +1212,14 @@
     </w:p>
     <w:p>
       <w:pPr>
+        <w:pStyle w:val="Heading4"/>
+      </w:pPr>
+      <w:r>
+        <w:t>In more detail</w:t>
+      </w:r>
+    </w:p>
+    <w:p>
+      <w:pPr>
         <w:pStyle w:val="Normal"/>
       </w:pPr>
       <w:r>
@@ -1158,8 +1313,13 @@
     <w:p>
       <w:pPr>
         <w:pStyle w:val="Heading1"/>
-      </w:pPr>
-      <w:r>
+        <w:pageBreakBefore/>
+      </w:pPr>
+      <w:r>
+        <w:rPr>
+          <w:sz w:val="44"/>
+          <w:szCs w:val="44"/>
+        </w:rPr>
         <w:t>The ecosystem</w:t>
       </w:r>
     </w:p>
@@ -1168,21 +1328,35 @@
         <w:pStyle w:val="Heading2"/>
       </w:pPr>
       <w:r>
+        <w:rPr>
+          <w:color w:val="1B1EA9"/>
+          <w:sz w:val="34"/>
+          <w:szCs w:val="34"/>
+        </w:rPr>
         <w:t>What is the BSV Association?</w:t>
       </w:r>
     </w:p>
     <w:p>
       <w:pPr>
-        <w:pStyle w:val="Normal"/>
+        <w:pStyle w:val="BSVAIntroduction"/>
       </w:pPr>
       <w:r>
         <w:rPr>
           <w:b/>
+          <w:color w:val="1B1EA9"/>
         </w:rPr>
-        <w:t>Short answer.</w:t>
-      </w:r>
-      <w:r>
-        <w:t xml:space="preserve"> The BSV Association (BSVA) is a non-profit based in Switzerland that looks after the BSV Blockchain. It maintains the software the network runs on, keeps the technical rulebook, teaches people how to use the technology, and promotes it. It is a caretaker, not an owner: it does not control the network, does not run exchanges, and does not hold anyone's coins.</w:t>
+        <w:t xml:space="preserve">Short answer — </w:t>
+      </w:r>
+      <w:r>
+        <w:t>The BSV Association (BSVA) is a non-profit based in Switzerland that looks after the BSV Blockchain. It maintains the software the network runs on, keeps the technical rulebook, teaches people how to use the technology, and promotes it. It is a caretaker, not an owner: it does not control the network, does not run exchanges, and does not hold anyone's coins.</w:t>
+      </w:r>
+    </w:p>
+    <w:p>
+      <w:pPr>
+        <w:pStyle w:val="Heading4"/>
+      </w:pPr>
+      <w:r>
+        <w:t>In more detail</w:t>
       </w:r>
     </w:p>
     <w:p>

</xml_diff>